<commit_message>
Contrat BD : reformule l'art. 1.4 (cadrage souple, autonomie préservée)
Co-Authored-By: Claude Opus 4.8 <noreply@anthropic.com>
Claude-Session: https://claude.ai/code/session_019efdNXoURJW334waUkjCUf
</commit_message>
<xml_diff>
--- a/07-Recrutement-Vivier/CONTRAT-PRESTATION-BD-VIV0010-Randrianasinoro.docx
+++ b/07-Recrutement-Vivier/CONTRAT-PRESTATION-BD-VIV0010-Randrianasinoro.docx
@@ -730,26 +730,54 @@
     </w:p>
     <w:p>
       <w:r>
-        <w:t>1.4. Les directives de la Société se limitent à la **définition des objectifs, des cibles</w:t>
-      </w:r>
-    </w:p>
-    <w:p>
-      <w:r>
-        <w:t>et du cadre qualité</w:t>
+        <w:t xml:space="preserve">1.4. La Société communique à la Prestataire les </w:t>
       </w:r>
       <w:r>
         <w:rPr>
           <w:b/>
         </w:rPr>
-        <w:t xml:space="preserve"> (positionnement, niches, messages-clés, conformité). Le </w:t>
-      </w:r>
-      <w:r>
-        <w:t>choix des</w:t>
+        <w:t>objectifs commerciaux</w:t>
+      </w:r>
+      <w:r>
+        <w:t>, les **cibles</w:t>
       </w:r>
     </w:p>
     <w:p>
       <w:r>
-        <w:t>moyens** pour les atteindre relève de la seule Prestataire.</w:t>
+        <w:t>prioritaires</w:t>
+      </w:r>
+      <w:r>
+        <w:rPr>
+          <w:b/>
+        </w:rPr>
+        <w:t xml:space="preserve"> et le </w:t>
+      </w:r>
+      <w:r>
+        <w:t>cadre qualité** de la marque (positionnement, niches, messages-clés,</w:t>
+      </w:r>
+    </w:p>
+    <w:p>
+      <w:r>
+        <w:t>exigences de conformité), ainsi que tout retour utile au bon déroulement de la mission. La</w:t>
+      </w:r>
+    </w:p>
+    <w:p>
+      <w:r>
+        <w:t xml:space="preserve">Prestataire </w:t>
+      </w:r>
+      <w:r>
+        <w:rPr>
+          <w:b/>
+        </w:rPr>
+        <w:t>conserve la maîtrise de l'organisation de son travail</w:t>
+      </w:r>
+      <w:r>
+        <w:t xml:space="preserve"> et du **choix des</w:t>
+      </w:r>
+    </w:p>
+    <w:p>
+      <w:r>
+        <w:t>moyens et méthodes** pour atteindre ces objectifs.</w:t>
       </w:r>
     </w:p>
     <w:p>

</xml_diff>

<commit_message>
Contrat BD : .docx allégé (logo en-tête compressé)
Co-Authored-By: Claude Opus 4.8 <noreply@anthropic.com>
Claude-Session: https://claude.ai/code/session_019efdNXoURJW334waUkjCUf
</commit_message>
<xml_diff>
--- a/07-Recrutement-Vivier/CONTRAT-PRESTATION-BD-VIV0010-Randrianasinoro.docx
+++ b/07-Recrutement-Vivier/CONTRAT-PRESTATION-BD-VIV0010-Randrianasinoro.docx
@@ -2600,7 +2600,7 @@
     <w:r>
       <w:drawing>
         <wp:inline xmlns:a="http://schemas.openxmlformats.org/drawingml/2006/main" xmlns:pic="http://schemas.openxmlformats.org/drawingml/2006/picture">
-          <wp:extent cx="1655999" cy="422117"/>
+          <wp:extent cx="1655999" cy="421200"/>
           <wp:docPr id="1" name="Picture 1"/>
           <wp:cNvGraphicFramePr>
             <a:graphicFrameLocks noChangeAspect="1"/>
@@ -2609,7 +2609,7 @@
             <a:graphicData uri="http://schemas.openxmlformats.org/drawingml/2006/picture">
               <pic:pic>
                 <pic:nvPicPr>
-                  <pic:cNvPr id="0" name="logo-salverys.png"/>
+                  <pic:cNvPr id="0" name="logo-small.png"/>
                   <pic:cNvPicPr/>
                 </pic:nvPicPr>
                 <pic:blipFill>
@@ -2621,7 +2621,7 @@
                 <pic:spPr>
                   <a:xfrm>
                     <a:off x="0" y="0"/>
-                    <a:ext cx="1655999" cy="422117"/>
+                    <a:ext cx="1655999" cy="421200"/>
                   </a:xfrm>
                   <a:prstGeom prst="rect"/>
                 </pic:spPr>

</xml_diff>

<commit_message>
Contrat BD : clarifie art. 3.1/4.3 (prime due à l'encaissement M+1, pas à la signature)
Co-Authored-By: Claude Opus 4.8 <noreply@anthropic.com>
Claude-Session: https://claude.ai/code/session_019efdNXoURJW334waUkjCUf
</commit_message>
<xml_diff>
--- a/07-Recrutement-Vivier/CONTRAT-PRESTATION-BD-VIV0010-Randrianasinoro.docx
+++ b/07-Recrutement-Vivier/CONTRAT-PRESTATION-BD-VIV0010-Randrianasinoro.docx
@@ -1083,7 +1083,16 @@
         <w:t>« Contrat gagné »</w:t>
       </w:r>
       <w:r>
-        <w:t xml:space="preserve"> s'entend, de manière cumulative :</w:t>
+        <w:t xml:space="preserve"> suppose la réunion </w:t>
+      </w:r>
+      <w:r>
+        <w:rPr>
+          <w:b/>
+        </w:rPr>
+        <w:t>cumulative</w:t>
+      </w:r>
+      <w:r>
+        <w:t xml:space="preserve"> des conditions suivantes :</w:t>
       </w:r>
     </w:p>
     <w:p>
@@ -1091,22 +1100,16 @@
         <w:pStyle w:val="ListBullet"/>
       </w:pPr>
       <w:r>
-        <w:t xml:space="preserve">d'un </w:t>
+        <w:t xml:space="preserve">un </w:t>
       </w:r>
       <w:r>
         <w:rPr>
           <w:b/>
         </w:rPr>
-        <w:t>donneur d'ordre (ou client) signé</w:t>
-      </w:r>
-      <w:r>
-        <w:t xml:space="preserve"> ; </w:t>
-      </w:r>
-      <w:r>
-        <w:rPr>
-          <w:b/>
-        </w:rPr>
-        <w:t>et</w:t>
+        <w:t>donneur d'ordre (ou client) a signé</w:t>
+      </w:r>
+      <w:r>
+        <w:t xml:space="preserve"> le contrat de prestation ;</w:t>
       </w:r>
     </w:p>
     <w:p>
@@ -1114,21 +1117,16 @@
         <w:pStyle w:val="ListBullet"/>
       </w:pPr>
       <w:r>
-        <w:t xml:space="preserve">dont le </w:t>
+        <w:t xml:space="preserve">la </w:t>
       </w:r>
       <w:r>
         <w:rPr>
           <w:b/>
         </w:rPr>
-        <w:t>premier mois de prestation a été effectivement ENCAISSÉ</w:t>
-      </w:r>
-      <w:r>
-        <w:t xml:space="preserve"> par la Société</w:t>
-      </w:r>
-    </w:p>
-    <w:p>
-      <w:r>
-        <w:t xml:space="preserve">(paiement reçu), après le pilote / mois de lancement à </w:t>
+        <w:t>facture du premier mois de prestation</w:t>
+      </w:r>
+      <w:r>
+        <w:t xml:space="preserve"> (mois de lancement, facturé à </w:t>
       </w:r>
       <w:r>
         <w:rPr>
@@ -1137,12 +1135,78 @@
         <w:t>−50 %</w:t>
       </w:r>
       <w:r>
-        <w:t>, **et sans</w:t>
+        <w:t>) a</w:t>
       </w:r>
     </w:p>
     <w:p>
       <w:r>
-        <w:t>résiliation** intervenue avant cet encaissement.</w:t>
+        <w:t xml:space="preserve">été </w:t>
+      </w:r>
+      <w:r>
+        <w:rPr>
+          <w:b/>
+        </w:rPr>
+        <w:t>effectivement ENCAISSÉE</w:t>
+      </w:r>
+      <w:r>
+        <w:t xml:space="preserve"> par la Société (paiement reçu sur son compte) ;</w:t>
+      </w:r>
+    </w:p>
+    <w:p>
+      <w:pPr>
+        <w:pStyle w:val="ListBullet"/>
+      </w:pPr>
+      <w:r>
+        <w:rPr>
+          <w:b/>
+        </w:rPr>
+        <w:t>aucune résiliation</w:t>
+      </w:r>
+      <w:r>
+        <w:t xml:space="preserve"> n'est intervenue avant cet encaissement.</w:t>
+      </w:r>
+    </w:p>
+    <w:p>
+      <w:r>
+        <w:t xml:space="preserve">La </w:t>
+      </w:r>
+      <w:r>
+        <w:rPr>
+          <w:b/>
+        </w:rPr>
+        <w:t>seule signature ne suffit pas</w:t>
+      </w:r>
+      <w:r>
+        <w:t xml:space="preserve"> : tant que le paiement du premier mois n'est pas</w:t>
+      </w:r>
+    </w:p>
+    <w:p>
+      <w:r>
+        <w:t xml:space="preserve">encaissé, </w:t>
+      </w:r>
+      <w:r>
+        <w:rPr>
+          <w:b/>
+        </w:rPr>
+        <w:t>aucune commission n'est due</w:t>
+      </w:r>
+      <w:r>
+        <w:t>. La facturation intervenant à terme échu et le</w:t>
+      </w:r>
+    </w:p>
+    <w:p>
+      <w:r>
+        <w:t>paiement à 15 jours fin de mois (art. 5.2), **l'encaissement du premier mois — et donc la</w:t>
+      </w:r>
+    </w:p>
+    <w:p>
+      <w:r>
+        <w:t>commission — interviennent au plus tôt le mois suivant la signature** (et non le mois de</w:t>
+      </w:r>
+    </w:p>
+    <w:p>
+      <w:r>
+        <w:t>signature).</w:t>
       </w:r>
     </w:p>
     <w:p>
@@ -1376,21 +1440,26 @@
     </w:p>
     <w:p>
       <w:r>
-        <w:t>4.3. La commission est facturable au titre du mois civil au cours duquel les conditions du</w:t>
+        <w:t>4.3. La commission est facturable au titre du **mois civil au cours duquel l'encaissement</w:t>
       </w:r>
     </w:p>
     <w:p>
       <w:r>
-        <w:t xml:space="preserve">« Contrat gagné » (art. 3.1) sont </w:t>
+        <w:t>du premier mois est constaté** (toutes les conditions de l'art. 3.1 étant réunies) ; elle</w:t>
+      </w:r>
+    </w:p>
+    <w:p>
+      <w:r>
+        <w:t xml:space="preserve">ne peut donc </w:t>
       </w:r>
       <w:r>
         <w:rPr>
           <w:b/>
         </w:rPr>
-        <w:t>toutes</w:t>
-      </w:r>
-      <w:r>
-        <w:t xml:space="preserve"> réunies (encaissement du 1er mois).</w:t>
+        <w:t>pas</w:t>
+      </w:r>
+      <w:r>
+        <w:t xml:space="preserve"> être facturée au titre du mois de signature.</w:t>
       </w:r>
     </w:p>
     <w:p>

</xml_diff>

<commit_message>
Contrat BD : prime déclenchée par l'encaissement du 2e mois plein (+ exemple timeline)
Co-Authored-By: Claude Opus 4.8 <noreply@anthropic.com>
Claude-Session: https://claude.ai/code/session_019efdNXoURJW334waUkjCUf
</commit_message>
<xml_diff>
--- a/07-Recrutement-Vivier/CONTRAT-PRESTATION-BD-VIV0010-Randrianasinoro.docx
+++ b/07-Recrutement-Vivier/CONTRAT-PRESTATION-BD-VIV0010-Randrianasinoro.docx
@@ -1117,13 +1117,13 @@
         <w:pStyle w:val="ListBullet"/>
       </w:pPr>
       <w:r>
-        <w:t xml:space="preserve">la </w:t>
+        <w:t xml:space="preserve">le </w:t>
       </w:r>
       <w:r>
         <w:rPr>
           <w:b/>
         </w:rPr>
-        <w:t>facture du premier mois de prestation</w:t>
+        <w:t>premier mois de prestation</w:t>
       </w:r>
       <w:r>
         <w:t xml:space="preserve"> (mois de lancement, facturé à </w:t>
@@ -1135,21 +1135,18 @@
         <w:t>−50 %</w:t>
       </w:r>
       <w:r>
-        <w:t>) a</w:t>
+        <w:t>) a été</w:t>
       </w:r>
     </w:p>
     <w:p>
-      <w:r>
-        <w:t xml:space="preserve">été </w:t>
-      </w:r>
       <w:r>
         <w:rPr>
           <w:b/>
         </w:rPr>
-        <w:t>effectivement ENCAISSÉE</w:t>
-      </w:r>
-      <w:r>
-        <w:t xml:space="preserve"> par la Société (paiement reçu sur son compte) ;</w:t>
+        <w:t>encaissé</w:t>
+      </w:r>
+      <w:r>
+        <w:t xml:space="preserve"> par la Société ;</w:t>
       </w:r>
     </w:p>
     <w:p>
@@ -1157,6 +1154,37 @@
         <w:pStyle w:val="ListBullet"/>
       </w:pPr>
       <w:r>
+        <w:t xml:space="preserve">le </w:t>
+      </w:r>
+      <w:r>
+        <w:rPr>
+          <w:b/>
+        </w:rPr>
+        <w:t>deuxième mois de prestation</w:t>
+      </w:r>
+      <w:r>
+        <w:t xml:space="preserve"> (</w:t>
+      </w:r>
+      <w:r>
+        <w:rPr>
+          <w:b/>
+        </w:rPr>
+        <w:t>premier mois à plein tarif</w:t>
+      </w:r>
+      <w:r>
+        <w:t>) a **également été</w:t>
+      </w:r>
+    </w:p>
+    <w:p>
+      <w:r>
+        <w:t>encaissé** par la Société (paiement reçu sur son compte) ;</w:t>
+      </w:r>
+    </w:p>
+    <w:p>
+      <w:pPr>
+        <w:pStyle w:val="ListBullet"/>
+      </w:pPr>
+      <w:r>
         <w:rPr>
           <w:b/>
         </w:rPr>
@@ -1177,36 +1205,63 @@
         <w:t>seule signature ne suffit pas</w:t>
       </w:r>
       <w:r>
-        <w:t xml:space="preserve"> : tant que le paiement du premier mois n'est pas</w:t>
+        <w:t>, ni même l'encaissement du seul mois de lancement à</w:t>
       </w:r>
     </w:p>
     <w:p>
       <w:r>
-        <w:t xml:space="preserve">encaissé, </w:t>
+        <w:t>−50 % : la commission n'est due qu'une fois **confirmé que le client poursuit au-delà du</w:t>
+      </w:r>
+    </w:p>
+    <w:p>
+      <w:r>
+        <w:t>pilote</w:t>
       </w:r>
       <w:r>
         <w:rPr>
           <w:b/>
         </w:rPr>
-        <w:t>aucune commission n'est due</w:t>
-      </w:r>
-      <w:r>
-        <w:t>. La facturation intervenant à terme échu et le</w:t>
+        <w:t xml:space="preserve">, c'est-à-dire </w:t>
+      </w:r>
+      <w:r>
+        <w:t>après encaissement du premier mois à plein tarif (deuxième mois de</w:t>
       </w:r>
     </w:p>
     <w:p>
       <w:r>
-        <w:t>paiement à 15 jours fin de mois (art. 5.2), **l'encaissement du premier mois — et donc la</w:t>
+        <w:t>prestation)**.</w:t>
       </w:r>
     </w:p>
     <w:p>
       <w:r>
-        <w:t>commission — interviennent au plus tôt le mois suivant la signature** (et non le mois de</w:t>
+        <w:rPr>
+          <w:b/>
+        </w:rPr>
+        <w:t>Exemple.</w:t>
+      </w:r>
+      <w:r>
+        <w:t xml:space="preserve"> Signature le 10 mai → début de prestation le 1er juin → encaissement du 1er</w:t>
       </w:r>
     </w:p>
     <w:p>
       <w:r>
-        <w:t>signature).</w:t>
+        <w:t>mois (−50 %) fin juin → encaissement du 2e mois (plein tarif) fin juillet → **commission</w:t>
+      </w:r>
+    </w:p>
+    <w:p>
+      <w:r>
+        <w:t>due et payable en juillet** (à 15 jours fin de mois, art. 5.2). La prime n'est donc versée</w:t>
+      </w:r>
+    </w:p>
+    <w:p>
+      <w:r>
+        <w:rPr>
+          <w:b/>
+        </w:rPr>
+        <w:t>ni au mois de signature, ni au seul mois de lancement</w:t>
+      </w:r>
+      <w:r>
+        <w:t>.</w:t>
       </w:r>
     </w:p>
     <w:p>
@@ -1440,26 +1495,40 @@
     </w:p>
     <w:p>
       <w:r>
-        <w:t>4.3. La commission est facturable au titre du **mois civil au cours duquel l'encaissement</w:t>
+        <w:t>4.3. La commission est facturable au titre du **mois civil au cours duquel le deuxième mois</w:t>
       </w:r>
     </w:p>
     <w:p>
       <w:r>
-        <w:t>du premier mois est constaté** (toutes les conditions de l'art. 3.1 étant réunies) ; elle</w:t>
+        <w:t>de prestation (premier mois à plein tarif) est encaissé** (toutes les conditions de</w:t>
       </w:r>
     </w:p>
     <w:p>
       <w:r>
-        <w:t xml:space="preserve">ne peut donc </w:t>
+        <w:t xml:space="preserve">l'art. 3.1 étant réunies) ; elle ne peut être facturée </w:t>
       </w:r>
       <w:r>
         <w:rPr>
           <w:b/>
         </w:rPr>
-        <w:t>pas</w:t>
-      </w:r>
-      <w:r>
-        <w:t xml:space="preserve"> être facturée au titre du mois de signature.</w:t>
+        <w:t>ni</w:t>
+      </w:r>
+      <w:r>
+        <w:t xml:space="preserve"> au titre du mois de</w:t>
+      </w:r>
+    </w:p>
+    <w:p>
+      <w:r>
+        <w:t xml:space="preserve">signature, </w:t>
+      </w:r>
+      <w:r>
+        <w:rPr>
+          <w:b/>
+        </w:rPr>
+        <w:t>ni</w:t>
+      </w:r>
+      <w:r>
+        <w:t xml:space="preserve"> au seul titre de l'encaissement du mois de lancement à −50 %.</w:t>
       </w:r>
     </w:p>
     <w:p>

</xml_diff>

<commit_message>
Contrat BD : maj identité, préambule, niches et activités (art. 1–2)
- Ci-après : ajout de « dénommée » (Société, Prestataire, Parties) ; retrait des gras
- Coordonnées Prestataire : ajout des deux-points (courriel :, téléphone :)
- Champ immatriculation : ligne plus longue, retrait des italiques
- Préambule : ajout « et canadien » + « et » devant helpdesk IT N1
- Art. 1.3 : majuscule initiale sur les 4 tirets ; suppression de « Emelia » dans la liste des outils
- Art. 2.1 : ordre des niches révisé (SaaS → Helpdesk → Médical)
- Art. 2.2 : majuscules initiales ; ajout branding Salverys / personal branding Valérien

Co-Authored-By: Claude Sonnet 4.6 <noreply@anthropic.com>
Claude-Session: https://claude.ai/code/session_019efdNXoURJW334waUkjCUf
</commit_message>
<xml_diff>
--- a/07-Recrutement-Vivier/CONTRAT-PRESTATION-BD-VIV0010-Randrianasinoro.docx
+++ b/07-Recrutement-Vivier/CONTRAT-PRESTATION-BD-VIV0010-Randrianasinoro.docx
@@ -249,25 +249,7 @@
     </w:p>
     <w:p>
       <w:r>
-        <w:t xml:space="preserve">Ci-après « </w:t>
-      </w:r>
-      <w:r>
-        <w:rPr>
-          <w:b/>
-        </w:rPr>
-        <w:t>la Société</w:t>
-      </w:r>
-      <w:r>
-        <w:t xml:space="preserve"> » ou « </w:t>
-      </w:r>
-      <w:r>
-        <w:rPr>
-          <w:b/>
-        </w:rPr>
-        <w:t>VJUS</w:t>
-      </w:r>
-      <w:r>
-        <w:t xml:space="preserve"> ».</w:t>
+        <w:t>Ci-après dénommée « la Société » ou « VJUS ».</w:t>
       </w:r>
     </w:p>
     <w:p>
@@ -297,30 +279,12 @@
     </w:p>
     <w:p>
       <w:r>
-        <w:t>Tanambao V, Toamasina 501 (Madagascar)</w:t>
-      </w:r>
-      <w:r>
-        <w:rPr>
-          <w:b/>
-        </w:rPr>
-        <w:t xml:space="preserve">, courriel </w:t>
-      </w:r>
-      <w:r>
-        <w:t>randrianasinoro@gmail.com**,</w:t>
+        <w:t>Tanambao V, Toamasina 501 (Madagascar)**, courriel : randrianasinoro@gmail.com,</w:t>
       </w:r>
     </w:p>
     <w:p>
       <w:r>
-        <w:t xml:space="preserve">téléphone </w:t>
-      </w:r>
-      <w:r>
-        <w:rPr>
-          <w:b/>
-        </w:rPr>
-        <w:t>+261 32 07 042 29 / +261 34 28 533 24</w:t>
-      </w:r>
-      <w:r>
-        <w:t>.</w:t>
+        <w:t>téléphone : +261 32 07 042 29 / +261 34 28 533 24.</w:t>
       </w:r>
     </w:p>
     <w:p>
@@ -334,21 +298,12 @@
         <w:t>travailleur indépendant</w:t>
       </w:r>
       <w:r>
-        <w:t>, immatriculée _(NIF / STAT / numéro</w:t>
+        <w:t>, immatriculée (NIF / STAT / numéro</w:t>
       </w:r>
     </w:p>
     <w:p>
       <w:r>
-        <w:t>d'enregistrement à compléter : [_____</w:t>
-      </w:r>
-      <w:r>
-        <w:rPr>
-          <w:i/>
-        </w:rPr>
-        <w:t>])</w:t>
-      </w:r>
-      <w:r>
-        <w:t>, déclarant exercer en son nom propre et assumer</w:t>
+        <w:t>d'enregistrement à compléter : [__________________________________________]), déclarant exercer en son nom propre et assumer</w:t>
       </w:r>
     </w:p>
     <w:p>
@@ -358,39 +313,12 @@
     </w:p>
     <w:p>
       <w:r>
-        <w:t xml:space="preserve">Ci-après « </w:t>
-      </w:r>
-      <w:r>
-        <w:rPr>
-          <w:b/>
-        </w:rPr>
-        <w:t>la Prestataire</w:t>
-      </w:r>
-      <w:r>
-        <w:t xml:space="preserve"> ».</w:t>
+        <w:t>Ci-après dénommée « la Prestataire ».</w:t>
       </w:r>
     </w:p>
     <w:p>
       <w:r>
-        <w:t xml:space="preserve">Ensemble dénommées « </w:t>
-      </w:r>
-      <w:r>
-        <w:rPr>
-          <w:b/>
-        </w:rPr>
-        <w:t>les Parties</w:t>
-      </w:r>
-      <w:r>
-        <w:t xml:space="preserve"> », et individuellement « </w:t>
-      </w:r>
-      <w:r>
-        <w:rPr>
-          <w:b/>
-        </w:rPr>
-        <w:t>une Partie</w:t>
-      </w:r>
-      <w:r>
-        <w:t xml:space="preserve"> ».</w:t>
+        <w:t>Ensemble dénommées « les Parties », et individuellement « une Partie ».</w:t>
       </w:r>
     </w:p>
     <w:p>
@@ -430,16 +358,7 @@
         <w:t>Salverys</w:t>
       </w:r>
       <w:r>
-        <w:t xml:space="preserve">, à destination de donneurs d'ordre et clients </w:t>
-      </w:r>
-      <w:r>
-        <w:rPr>
-          <w:b/>
-        </w:rPr>
-        <w:t>français</w:t>
-      </w:r>
-      <w:r>
-        <w:t>, sur trois</w:t>
+        <w:t>, à destination de donneurs d'ordre et clients français et canadien, sur trois</w:t>
       </w:r>
     </w:p>
     <w:p>
@@ -449,7 +368,7 @@
     </w:p>
     <w:p>
       <w:r>
-        <w:t xml:space="preserve">(3) helpdesk IT N1. Sa stratégie de mise sur le marché privilégie la </w:t>
+        <w:t xml:space="preserve">(3) et helpdesk IT N1. Sa stratégie de mise sur le marché privilégie la </w:t>
       </w:r>
       <w:r>
         <w:rPr>
@@ -607,7 +526,7 @@
         <w:pStyle w:val="ListBullet"/>
       </w:pPr>
       <w:r>
-        <w:t xml:space="preserve">la Prestataire </w:t>
+        <w:t xml:space="preserve">La Prestataire </w:t>
       </w:r>
       <w:r>
         <w:rPr>
@@ -643,7 +562,7 @@
         <w:pStyle w:val="ListBullet"/>
       </w:pPr>
       <w:r>
-        <w:t xml:space="preserve">la Prestataire </w:t>
+        <w:t xml:space="preserve">La Prestataire </w:t>
       </w:r>
       <w:r>
         <w:rPr>
@@ -657,7 +576,7 @@
     </w:p>
     <w:p>
       <w:r>
-        <w:t>les outils mis à disposition par la Société (CRM, licences Emelia, etc.) le sont aux</w:t>
+        <w:t>les outils mis à disposition par la Société (CRM, licences, etc.) le sont aux</w:t>
       </w:r>
     </w:p>
     <w:p>
@@ -670,7 +589,7 @@
         <w:pStyle w:val="ListBullet"/>
       </w:pPr>
       <w:r>
-        <w:t xml:space="preserve">la Prestataire </w:t>
+        <w:t xml:space="preserve">La Prestataire </w:t>
       </w:r>
       <w:r>
         <w:rPr>
@@ -706,7 +625,7 @@
         <w:pStyle w:val="ListBullet"/>
       </w:pPr>
       <w:r>
-        <w:t xml:space="preserve">la Prestataire </w:t>
+        <w:t xml:space="preserve">La Prestataire </w:t>
       </w:r>
       <w:r>
         <w:rPr>
@@ -826,10 +745,10 @@
         <w:rPr>
           <w:b/>
         </w:rPr>
-        <w:t>télésecrétariat médical</w:t>
-      </w:r>
-      <w:r>
-        <w:t xml:space="preserve"> (priorité absolue) ;</w:t>
+        <w:t>support applicatif N1 pour éditeurs SaaS français</w:t>
+      </w:r>
+      <w:r>
+        <w:t xml:space="preserve"> ;</w:t>
       </w:r>
     </w:p>
     <w:p>
@@ -840,7 +759,7 @@
         <w:rPr>
           <w:b/>
         </w:rPr>
-        <w:t>support applicatif N1 pour éditeurs SaaS français</w:t>
+        <w:t>helpdesk IT N1 distant</w:t>
       </w:r>
       <w:r>
         <w:t xml:space="preserve"> ;</w:t>
@@ -854,7 +773,7 @@
         <w:rPr>
           <w:b/>
         </w:rPr>
-        <w:t>helpdesk IT N1 distant</w:t>
+        <w:t>télésecrétariat médical</w:t>
       </w:r>
       <w:r>
         <w:t>.</w:t>
@@ -903,7 +822,7 @@
         <w:pStyle w:val="ListBullet"/>
       </w:pPr>
       <w:r>
-        <w:t>ciblage et constitution de listes de prospects qualifiées ;</w:t>
+        <w:t>Ciblage et constitution de listes de prospects qualifiées ;</w:t>
       </w:r>
     </w:p>
     <w:p>
@@ -911,22 +830,7 @@
         <w:pStyle w:val="ListBullet"/>
       </w:pPr>
       <w:r>
-        <w:rPr>
-          <w:b/>
-        </w:rPr>
-        <w:t>prospection</w:t>
-      </w:r>
-      <w:r>
-        <w:t xml:space="preserve"> (cold mailing via l'outil </w:t>
-      </w:r>
-      <w:r>
-        <w:rPr>
-          <w:b/>
-        </w:rPr>
-        <w:t>Emelia</w:t>
-      </w:r>
-      <w:r>
-        <w:t>, et tout canal pertinent) ;</w:t>
+        <w:t>Branding de la marque Salverys et du personal branding de Valérien ;</w:t>
       </w:r>
     </w:p>
     <w:p>
@@ -934,7 +838,22 @@
         <w:pStyle w:val="ListBullet"/>
       </w:pPr>
       <w:r>
-        <w:t>qualification des prospects et prise de rendez-vous ;</w:t>
+        <w:rPr>
+          <w:b/>
+        </w:rPr>
+        <w:t>Prospection</w:t>
+      </w:r>
+      <w:r>
+        <w:t xml:space="preserve"> (cold mailing via l'outil </w:t>
+      </w:r>
+      <w:r>
+        <w:rPr>
+          <w:b/>
+        </w:rPr>
+        <w:t>Emelia</w:t>
+      </w:r>
+      <w:r>
+        <w:t>, et tout canal pertinent) ;</w:t>
       </w:r>
     </w:p>
     <w:p>
@@ -942,13 +861,7 @@
         <w:pStyle w:val="ListBullet"/>
       </w:pPr>
       <w:r>
-        <w:rPr>
-          <w:b/>
-        </w:rPr>
-        <w:t>closing</w:t>
-      </w:r>
-      <w:r>
-        <w:t xml:space="preserve"> (négociation et signature des donneurs d'ordre) ;</w:t>
+        <w:t>Qualification des prospects et prise de rendez-vous ;</w:t>
       </w:r>
     </w:p>
     <w:p>
@@ -956,7 +869,21 @@
         <w:pStyle w:val="ListBullet"/>
       </w:pPr>
       <w:r>
-        <w:t xml:space="preserve">suivi et mise à jour du </w:t>
+        <w:rPr>
+          <w:b/>
+        </w:rPr>
+        <w:t>Closing</w:t>
+      </w:r>
+      <w:r>
+        <w:t xml:space="preserve"> (négociation et signature des donneurs d'ordre) ;</w:t>
+      </w:r>
+    </w:p>
+    <w:p>
+      <w:pPr>
+        <w:pStyle w:val="ListBullet"/>
+      </w:pPr>
+      <w:r>
+        <w:t xml:space="preserve">Suivi et mise à jour du </w:t>
       </w:r>
       <w:r>
         <w:rPr>
@@ -2738,7 +2665,7 @@
     <w:r>
       <w:drawing>
         <wp:inline xmlns:a="http://schemas.openxmlformats.org/drawingml/2006/main" xmlns:pic="http://schemas.openxmlformats.org/drawingml/2006/picture">
-          <wp:extent cx="1655999" cy="421200"/>
+          <wp:extent cx="1655999" cy="422117"/>
           <wp:docPr id="1" name="Picture 1"/>
           <wp:cNvGraphicFramePr>
             <a:graphicFrameLocks noChangeAspect="1"/>
@@ -2747,7 +2674,7 @@
             <a:graphicData uri="http://schemas.openxmlformats.org/drawingml/2006/picture">
               <pic:pic>
                 <pic:nvPicPr>
-                  <pic:cNvPr id="0" name="logo-small.png"/>
+                  <pic:cNvPr id="0" name="logo-salverys.png"/>
                   <pic:cNvPicPr/>
                 </pic:nvPicPr>
                 <pic:blipFill>
@@ -2759,7 +2686,7 @@
                 <pic:spPr>
                   <a:xfrm>
                     <a:off x="0" y="0"/>
-                    <a:ext cx="1655999" cy="421200"/>
+                    <a:ext cx="1655999" cy="422117"/>
                   </a:xfrm>
                   <a:prstGeom prst="rect"/>
                 </pic:spPr>

</xml_diff>

<commit_message>
Contrat BD : art. 2.4 — non-reconduction si aucun résultat à l'issue de la période initiale
Ajoute un alinéa précisant que l'absence de prospect en cours de négociation avancée
ou de contrat signé à l'issue des 3 mois constitue un motif légitime de non-reconduction,
sans rupture fautive ni indemnité, avec notification 15 jours avant le terme.

Co-Authored-By: Claude Sonnet 4.6 <noreply@anthropic.com>
Claude-Session: https://claude.ai/code/session_019efdNXoURJW334waUkjCUf
</commit_message>
<xml_diff>
--- a/07-Recrutement-Vivier/CONTRAT-PRESTATION-BD-VIV0010-Randrianasinoro.docx
+++ b/07-Recrutement-Vivier/CONTRAT-PRESTATION-BD-VIV0010-Randrianasinoro.docx
@@ -984,6 +984,68 @@
     <w:p>
       <w:r>
         <w:t>garantie de résultat chiffré.</w:t>
+      </w:r>
+    </w:p>
+    <w:p>
+      <w:r>
+        <w:t>Toutefois, l'**absence de tout prospect en cours de négociation avancée ou de contrat</w:t>
+      </w:r>
+    </w:p>
+    <w:p>
+      <w:r>
+        <w:t>signé</w:t>
+      </w:r>
+      <w:r>
+        <w:rPr>
+          <w:b/>
+        </w:rPr>
+        <w:t xml:space="preserve"> à l'issue de la </w:t>
+      </w:r>
+      <w:r>
+        <w:t>période initiale de trois (3) mois** (art. 6.1) constituera un</w:t>
+      </w:r>
+    </w:p>
+    <w:p>
+      <w:r>
+        <w:t xml:space="preserve">motif légitime pour la Société de </w:t>
+      </w:r>
+      <w:r>
+        <w:rPr>
+          <w:b/>
+        </w:rPr>
+        <w:t>ne pas reconduire le contrat</w:t>
+      </w:r>
+      <w:r>
+        <w:t>, sans que cette</w:t>
+      </w:r>
+    </w:p>
+    <w:p>
+      <w:r>
+        <w:t>décision puisse être qualifiée de rupture fautive ni ouvrir droit à indemnité. La Société</w:t>
+      </w:r>
+    </w:p>
+    <w:p>
+      <w:r>
+        <w:t xml:space="preserve">en informera la Prestataire par écrit au plus tard </w:t>
+      </w:r>
+      <w:r>
+        <w:rPr>
+          <w:b/>
+        </w:rPr>
+        <w:t>quinze (15) jours avant le terme</w:t>
+      </w:r>
+      <w:r>
+        <w:t xml:space="preserve"> de</w:t>
+      </w:r>
+    </w:p>
+    <w:p>
+      <w:r>
+        <w:t>la période initiale ; en l'absence de notification dans ce délai, le contrat se reconduit</w:t>
+      </w:r>
+    </w:p>
+    <w:p>
+      <w:r>
+        <w:t>dans les conditions de l'art. 6.2.</w:t>
       </w:r>
     </w:p>
     <w:p>

</xml_diff>

<commit_message>
Contrat BD : art. 4.4 — paiement en Ar au taux BCM du jour de facturation
Supprime le taux fixe ~5 000 Ar/€ ; précise que la prime est libellée en € à
titre indicatif et convertie en ariary au taux officiel BCM à la date d'émission
de la facture. Aucun paiement en euros.

Co-Authored-By: Claude Sonnet 4.6 <noreply@anthropic.com>
Claude-Session: https://claude.ai/code/session_019efdNXoURJW334waUkjCUf
</commit_message>
<xml_diff>
--- a/07-Recrutement-Vivier/CONTRAT-PRESTATION-BD-VIV0010-Randrianasinoro.docx
+++ b/07-Recrutement-Vivier/CONTRAT-PRESTATION-BD-VIV0010-Randrianasinoro.docx
@@ -1531,56 +1531,36 @@
         <w:t>Devise et conversion.</w:t>
       </w:r>
       <w:r>
-        <w:t xml:space="preserve"> Les montants sont </w:t>
+        <w:t xml:space="preserve"> Tous les montants — honoraires fixes et commission de</w:t>
+      </w:r>
+    </w:p>
+    <w:p>
+      <w:r>
+        <w:t xml:space="preserve">performance — sont </w:t>
       </w:r>
       <w:r>
         <w:rPr>
           <w:b/>
         </w:rPr>
-        <w:t>payés en ariary (Ar)</w:t>
-      </w:r>
-      <w:r>
-        <w:t>. Lorsqu'un</w:t>
+        <w:t>payés exclusivement en ariary (Ar)</w:t>
+      </w:r>
+      <w:r>
+        <w:t>. La commission est exprimée en</w:t>
       </w:r>
     </w:p>
     <w:p>
       <w:r>
-        <w:t>montant est exprimé en euros (commission), la conversion s'effectue au taux de référence</w:t>
+        <w:t>euros à titre indicatif uniquement ; elle est **convertie en ariary au taux de change</w:t>
       </w:r>
     </w:p>
     <w:p>
       <w:r>
-        <w:t xml:space="preserve">interne </w:t>
-      </w:r>
-      <w:r>
-        <w:rPr>
-          <w:b/>
-        </w:rPr>
-        <w:t>~5 000 Ar = 1 €</w:t>
-      </w:r>
-      <w:r>
-        <w:t xml:space="preserve"> </w:t>
-      </w:r>
-      <w:r>
-        <w:rPr>
-          <w:i/>
-        </w:rPr>
-        <w:t>(modalité de fixation du taux à préciser : [</w:t>
-      </w:r>
-      <w:r>
-        <w:rPr>
-          <w:i/>
-        </w:rPr>
-        <w:t>__</w:t>
-      </w:r>
-      <w:r>
-        <w:rPr>
-          <w:i/>
-        </w:rPr>
-        <w:t>])</w:t>
-      </w:r>
-      <w:r>
-        <w:t>.</w:t>
+        <w:t>officiel EUR/MGA publié par la Banque Centrale de Madagascar (BCM) à la date d'émission</w:t>
+      </w:r>
+    </w:p>
+    <w:p>
+      <w:r>
+        <w:t>de la facture** correspondante. Aucun paiement n'est effectué en euros.</w:t>
       </w:r>
     </w:p>
     <w:p>

</xml_diff>

<commit_message>
Contrat BD : art. 5.3 — moyen de paiement précisé sur la facture
Supprime le placeholder ; le moyen de paiement et les coordonnées sont
désormais indiqués par la Prestataire sur chaque facture.

Co-Authored-By: Claude Sonnet 4.6 <noreply@anthropic.com>
Claude-Session: https://claude.ai/code/session_019efdNXoURJW334waUkjCUf
</commit_message>
<xml_diff>
--- a/07-Recrutement-Vivier/CONTRAT-PRESTATION-BD-VIV0010-Randrianasinoro.docx
+++ b/07-Recrutement-Vivier/CONTRAT-PRESTATION-BD-VIV0010-Randrianasinoro.docx
@@ -1644,28 +1644,17 @@
         <w:t>Moyen de paiement</w:t>
       </w:r>
       <w:r>
-        <w:t xml:space="preserve"> : </w:t>
-      </w:r>
-      <w:r>
-        <w:rPr>
-          <w:i/>
-        </w:rPr>
-        <w:t>[à préciser — virement / mobile money / autre : [</w:t>
-      </w:r>
-      <w:r>
-        <w:rPr>
-          <w:i/>
-        </w:rPr>
-        <w:t>__</w:t>
-      </w:r>
-      <w:r>
-        <w:rPr>
-          <w:i/>
-        </w:rPr>
-        <w:t>]]</w:t>
-      </w:r>
-      <w:r>
-        <w:t>.</w:t>
+        <w:t xml:space="preserve"> : le moyen de paiement retenu (virement bancaire, mobile money</w:t>
+      </w:r>
+    </w:p>
+    <w:p>
+      <w:r>
+        <w:t>ou autre) ainsi que les coordonnées nécessaires au règlement sont **indiqués par la</w:t>
+      </w:r>
+    </w:p>
+    <w:p>
+      <w:r>
+        <w:t>Prestataire sur chaque facture**. La Société effectue le paiement selon ces instructions.</w:t>
       </w:r>
     </w:p>
     <w:p>

</xml_diff>

<commit_message>
Contrat BD : art. 6.2 — reconduction tacite par mois
Co-Authored-By: Claude Sonnet 4.6 <noreply@anthropic.com>
Claude-Session: https://claude.ai/code/session_019efdNXoURJW334waUkjCUf
</commit_message>
<xml_diff>
--- a/07-Recrutement-Vivier/CONTRAT-PRESTATION-BD-VIV0010-Randrianasinoro.docx
+++ b/07-Recrutement-Vivier/CONTRAT-PRESTATION-BD-VIV0010-Randrianasinoro.docx
@@ -1710,29 +1710,17 @@
         <w:t>Reconduction</w:t>
       </w:r>
       <w:r>
-        <w:t xml:space="preserve"> : à l'issue de la période initiale, le contrat se </w:t>
-      </w:r>
-      <w:r>
-        <w:rPr>
-          <w:b/>
-        </w:rPr>
-        <w:t>reconduit</w:t>
+        <w:t xml:space="preserve"> : à l'issue de la période initiale, le contrat se **reconduit</w:t>
       </w:r>
     </w:p>
     <w:p>
       <w:r>
-        <w:rPr>
-          <w:i/>
-        </w:rPr>
-        <w:t>[tacitement / par accord exprès — à préciser]</w:t>
-      </w:r>
-      <w:r>
-        <w:t xml:space="preserve"> pour des périodes successives, tant</w:t>
+        <w:t>tacitement** pour des périodes successives d'un (1) mois, tant qu'aucune Partie ne l'a</w:t>
       </w:r>
     </w:p>
     <w:p>
       <w:r>
-        <w:t>qu'aucune Partie ne l'a résilié.</w:t>
+        <w:t>résilié dans les conditions de l'art. 6.3.</w:t>
       </w:r>
     </w:p>
     <w:p>

</xml_diff>

<commit_message>
Contrat BD : art. 6.4 — délai de remédiation fixé à 7 jours
Co-Authored-By: Claude Sonnet 4.6 <noreply@anthropic.com>
Claude-Session: https://claude.ai/code/session_019efdNXoURJW334waUkjCUf
</commit_message>
<xml_diff>
--- a/07-Recrutement-Vivier/CONTRAT-PRESTATION-BD-VIV0010-Randrianasinoro.docx
+++ b/07-Recrutement-Vivier/CONTRAT-PRESTATION-BD-VIV0010-Randrianasinoro.docx
@@ -1783,15 +1783,15 @@
         <w:rPr>
           <w:b/>
         </w:rPr>
-        <w:t>[__ jours]</w:t>
-      </w:r>
-      <w:r>
-        <w:t xml:space="preserve"> après mise en demeure écrite restée sans effet, l'autre Partie peut</w:t>
+        <w:t>sept (7) jours</w:t>
+      </w:r>
+      <w:r>
+        <w:t xml:space="preserve"> après mise en demeure écrite restée sans effet, l'autre Partie</w:t>
       </w:r>
     </w:p>
     <w:p>
       <w:r>
-        <w:t>résilier de plein droit, sans préjudice de tous dommages-intérêts.</w:t>
+        <w:t>peut résilier de plein droit, sans préjudice de tous dommages-intérêts.</w:t>
       </w:r>
     </w:p>
     <w:p>

</xml_diff>

<commit_message>
Contrat BD : art. 7.2 et 7.5 — non-concurrence étendue au marché canadien
Co-Authored-By: Claude Sonnet 4.6 <noreply@anthropic.com>
Claude-Session: https://claude.ai/code/session_019efdNXoURJW334waUkjCUf
</commit_message>
<xml_diff>
--- a/07-Recrutement-Vivier/CONTRAT-PRESTATION-BD-VIV0010-Randrianasinoro.docx
+++ b/07-Recrutement-Vivier/CONTRAT-PRESTATION-BD-VIV0010-Randrianasinoro.docx
@@ -1927,7 +1927,7 @@
     </w:p>
     <w:p>
       <w:r>
-        <w:t>SaaS, helpdesk IT N1 — à destination du marché français**.</w:t>
+        <w:t>SaaS, helpdesk IT N1 — à destination des marchés français et canadien**.</w:t>
       </w:r>
     </w:p>
     <w:p>
@@ -1989,12 +1989,12 @@
     </w:p>
     <w:p>
       <w:r>
-        <w:t>7.5. Ces stipulations, limitées aux concurrents directs sur les niches et au marché</w:t>
+        <w:t>7.5. Ces stipulations, limitées aux concurrents directs sur les niches et aux marchés</w:t>
       </w:r>
     </w:p>
     <w:p>
       <w:r>
-        <w:t xml:space="preserve">français, sont </w:t>
+        <w:t xml:space="preserve">français et canadien, sont </w:t>
       </w:r>
       <w:r>
         <w:rPr>
@@ -2003,10 +2003,13 @@
         <w:t>proportionnées</w:t>
       </w:r>
       <w:r>
-        <w:t xml:space="preserve"> à la protection des intérêts légitimes de la Société et</w:t>
+        <w:t xml:space="preserve"> à la protection des intérêts légitimes de</w:t>
       </w:r>
     </w:p>
     <w:p>
+      <w:r>
+        <w:t xml:space="preserve">la Société et </w:t>
+      </w:r>
       <w:r>
         <w:rPr>
           <w:b/>
@@ -2014,7 +2017,12 @@
         <w:t>ne privent pas</w:t>
       </w:r>
       <w:r>
-        <w:t xml:space="preserve"> la Prestataire d'exercer son activité auprès d'autres clients.</w:t>
+        <w:t xml:space="preserve"> la Prestataire d'exercer son activité auprès d'autres</w:t>
+      </w:r>
+    </w:p>
+    <w:p>
+      <w:r>
+        <w:t>clients.</w:t>
       </w:r>
     </w:p>
     <w:p>

</xml_diff>